<commit_message>
update to spacing for captioned figures and figure captions
</commit_message>
<xml_diff>
--- a/word-styles-reference-01.docx
+++ b/word-styles-reference-01.docx
@@ -130,20 +130,1483 @@
     </w:p>
     <w:p>
       <w:pPr>
-        <w:pStyle w:val="Heading1"/>
+        <w:keepNext/>
+        <w:keepLines/>
+        <w:spacing w:before="360" w:after="80"/>
+        <w:outlineLvl w:val="0"/>
+        <w:rPr>
+          <w:rFonts w:ascii="Aptos Display" w:eastAsia="Times New Roman" w:hAnsi="Aptos Display" w:cs="Times New Roman"/>
+          <w:color w:val="000000" w:themeColor="text1"/>
+          <w:sz w:val="40"/>
+          <w:szCs w:val="40"/>
+        </w:rPr>
       </w:pPr>
       <w:bookmarkStart w:id="2" w:name="conclusion"/>
+      <w:bookmarkStart w:id="3" w:name="ref-stednick_2022_data"/>
+      <w:bookmarkStart w:id="4" w:name="refs"/>
       <w:bookmarkEnd w:id="1"/>
       <w:r>
+        <w:rPr>
+          <w:rFonts w:ascii="Aptos Display" w:eastAsia="Times New Roman" w:hAnsi="Aptos Display" w:cs="Times New Roman"/>
+          <w:color w:val="000000" w:themeColor="text1"/>
+          <w:sz w:val="40"/>
+          <w:szCs w:val="40"/>
+        </w:rPr>
         <w:t>Conclusion</w:t>
       </w:r>
     </w:p>
     <w:p>
       <w:pPr>
+        <w:spacing w:before="180" w:after="180"/>
+        <w:rPr>
+          <w:rFonts w:ascii="Aptos" w:eastAsia="Aptos" w:hAnsi="Aptos" w:cs="Times New Roman"/>
+          <w:color w:val="000000" w:themeColor="text1"/>
+        </w:rPr>
+      </w:pPr>
+      <w:r>
+        <w:rPr>
+          <w:rFonts w:ascii="Aptos" w:eastAsia="Aptos" w:hAnsi="Aptos" w:cs="Times New Roman"/>
+          <w:color w:val="000000" w:themeColor="text1"/>
+        </w:rPr>
+        <w:t xml:space="preserve">Before presenting the results of our analysis, we would like to acknowledge some of the </w:t>
+      </w:r>
+      <w:proofErr w:type="gramStart"/>
+      <w:r>
+        <w:rPr>
+          <w:rFonts w:ascii="Aptos" w:eastAsia="Aptos" w:hAnsi="Aptos" w:cs="Times New Roman"/>
+          <w:color w:val="000000" w:themeColor="text1"/>
+        </w:rPr>
+        <w:t>limitations;</w:t>
+      </w:r>
+      <w:proofErr w:type="gramEnd"/>
+    </w:p>
+    <w:tbl>
+      <w:tblPr>
+        <w:tblW w:w="0" w:type="auto"/>
+        <w:tblLayout w:type="fixed"/>
+        <w:tblLook w:val="0420" w:firstRow="1" w:lastRow="0" w:firstColumn="0" w:lastColumn="0" w:noHBand="0" w:noVBand="1"/>
+      </w:tblPr>
+      <w:tblGrid>
+        <w:gridCol w:w="1080"/>
+        <w:gridCol w:w="1080"/>
+        <w:gridCol w:w="1080"/>
+        <w:gridCol w:w="1080"/>
+        <w:gridCol w:w="1080"/>
+        <w:gridCol w:w="1080"/>
+      </w:tblGrid>
+      <w:tr>
+        <w:trPr>
+          <w:tblHeader/>
+        </w:trPr>
+        <w:tc>
+          <w:tcPr>
+            <w:tcW w:w="1080" w:type="dxa"/>
+            <w:tcBorders>
+              <w:top w:val="single" w:sz="12" w:space="0" w:color="666666"/>
+              <w:left w:val="nil"/>
+              <w:bottom w:val="single" w:sz="12" w:space="0" w:color="666666"/>
+              <w:right w:val="nil"/>
+            </w:tcBorders>
+            <w:shd w:val="clear" w:color="auto" w:fill="FFFFFF"/>
+            <w:tcMar>
+              <w:top w:w="0" w:type="dxa"/>
+              <w:left w:w="0" w:type="dxa"/>
+              <w:bottom w:w="0" w:type="dxa"/>
+              <w:right w:w="0" w:type="dxa"/>
+            </w:tcMar>
+            <w:vAlign w:val="center"/>
+            <w:hideMark/>
+          </w:tcPr>
+          <w:p>
+            <w:pPr>
+              <w:spacing w:before="100" w:after="100" w:line="240" w:lineRule="auto"/>
+              <w:ind w:left="100" w:right="100"/>
+              <w:rPr>
+                <w:rFonts w:ascii="Arial" w:eastAsia="Arial" w:hAnsi="Arial" w:cs="Arial"/>
+                <w:color w:val="000000"/>
+                <w:sz w:val="22"/>
+                <w:szCs w:val="22"/>
+              </w:rPr>
+            </w:pPr>
+            <w:r>
+              <w:rPr>
+                <w:rFonts w:ascii="Arial" w:eastAsia="Arial" w:hAnsi="Arial" w:cs="Arial"/>
+                <w:color w:val="000000"/>
+                <w:sz w:val="22"/>
+                <w:szCs w:val="22"/>
+              </w:rPr>
+              <w:t>IV</w:t>
+            </w:r>
+          </w:p>
+        </w:tc>
+        <w:tc>
+          <w:tcPr>
+            <w:tcW w:w="1080" w:type="dxa"/>
+            <w:tcBorders>
+              <w:top w:val="single" w:sz="12" w:space="0" w:color="666666"/>
+              <w:left w:val="nil"/>
+              <w:bottom w:val="single" w:sz="12" w:space="0" w:color="666666"/>
+              <w:right w:val="nil"/>
+            </w:tcBorders>
+            <w:shd w:val="clear" w:color="auto" w:fill="FFFFFF"/>
+            <w:tcMar>
+              <w:top w:w="0" w:type="dxa"/>
+              <w:left w:w="0" w:type="dxa"/>
+              <w:bottom w:w="0" w:type="dxa"/>
+              <w:right w:w="0" w:type="dxa"/>
+            </w:tcMar>
+            <w:vAlign w:val="center"/>
+            <w:hideMark/>
+          </w:tcPr>
+          <w:p>
+            <w:pPr>
+              <w:spacing w:before="100" w:after="100" w:line="240" w:lineRule="auto"/>
+              <w:ind w:left="100" w:right="100"/>
+              <w:jc w:val="right"/>
+              <w:rPr>
+                <w:rFonts w:ascii="Arial" w:eastAsia="Arial" w:hAnsi="Arial" w:cs="Arial"/>
+                <w:color w:val="000000"/>
+                <w:sz w:val="22"/>
+                <w:szCs w:val="22"/>
+              </w:rPr>
+            </w:pPr>
+            <w:proofErr w:type="spellStart"/>
+            <w:r>
+              <w:rPr>
+                <w:rFonts w:ascii="Arial" w:eastAsia="Arial" w:hAnsi="Arial" w:cs="Arial"/>
+                <w:color w:val="000000"/>
+                <w:sz w:val="22"/>
+                <w:szCs w:val="22"/>
+              </w:rPr>
+              <w:t>Df</w:t>
+            </w:r>
+            <w:proofErr w:type="spellEnd"/>
+          </w:p>
+        </w:tc>
+        <w:tc>
+          <w:tcPr>
+            <w:tcW w:w="1080" w:type="dxa"/>
+            <w:tcBorders>
+              <w:top w:val="single" w:sz="12" w:space="0" w:color="666666"/>
+              <w:left w:val="nil"/>
+              <w:bottom w:val="single" w:sz="12" w:space="0" w:color="666666"/>
+              <w:right w:val="nil"/>
+            </w:tcBorders>
+            <w:shd w:val="clear" w:color="auto" w:fill="FFFFFF"/>
+            <w:tcMar>
+              <w:top w:w="0" w:type="dxa"/>
+              <w:left w:w="0" w:type="dxa"/>
+              <w:bottom w:w="0" w:type="dxa"/>
+              <w:right w:w="0" w:type="dxa"/>
+            </w:tcMar>
+            <w:vAlign w:val="center"/>
+            <w:hideMark/>
+          </w:tcPr>
+          <w:p>
+            <w:pPr>
+              <w:spacing w:before="100" w:after="100" w:line="240" w:lineRule="auto"/>
+              <w:ind w:left="100" w:right="100"/>
+              <w:jc w:val="right"/>
+              <w:rPr>
+                <w:rFonts w:ascii="Arial" w:eastAsia="Arial" w:hAnsi="Arial" w:cs="Arial"/>
+                <w:color w:val="000000"/>
+                <w:sz w:val="22"/>
+                <w:szCs w:val="22"/>
+              </w:rPr>
+            </w:pPr>
+            <w:proofErr w:type="spellStart"/>
+            <w:r>
+              <w:rPr>
+                <w:rFonts w:ascii="Arial" w:eastAsia="Arial" w:hAnsi="Arial" w:cs="Arial"/>
+                <w:color w:val="000000"/>
+                <w:sz w:val="22"/>
+                <w:szCs w:val="22"/>
+              </w:rPr>
+              <w:t>Sum.Sq</w:t>
+            </w:r>
+            <w:proofErr w:type="spellEnd"/>
+          </w:p>
+        </w:tc>
+        <w:tc>
+          <w:tcPr>
+            <w:tcW w:w="1080" w:type="dxa"/>
+            <w:tcBorders>
+              <w:top w:val="single" w:sz="12" w:space="0" w:color="666666"/>
+              <w:left w:val="nil"/>
+              <w:bottom w:val="single" w:sz="12" w:space="0" w:color="666666"/>
+              <w:right w:val="nil"/>
+            </w:tcBorders>
+            <w:shd w:val="clear" w:color="auto" w:fill="FFFFFF"/>
+            <w:tcMar>
+              <w:top w:w="0" w:type="dxa"/>
+              <w:left w:w="0" w:type="dxa"/>
+              <w:bottom w:w="0" w:type="dxa"/>
+              <w:right w:w="0" w:type="dxa"/>
+            </w:tcMar>
+            <w:vAlign w:val="center"/>
+            <w:hideMark/>
+          </w:tcPr>
+          <w:p>
+            <w:pPr>
+              <w:spacing w:before="100" w:after="100" w:line="240" w:lineRule="auto"/>
+              <w:ind w:left="100" w:right="100"/>
+              <w:jc w:val="right"/>
+              <w:rPr>
+                <w:rFonts w:ascii="Arial" w:eastAsia="Arial" w:hAnsi="Arial" w:cs="Arial"/>
+                <w:color w:val="000000"/>
+                <w:sz w:val="22"/>
+                <w:szCs w:val="22"/>
+              </w:rPr>
+            </w:pPr>
+            <w:proofErr w:type="spellStart"/>
+            <w:r>
+              <w:rPr>
+                <w:rFonts w:ascii="Arial" w:eastAsia="Arial" w:hAnsi="Arial" w:cs="Arial"/>
+                <w:color w:val="000000"/>
+                <w:sz w:val="22"/>
+                <w:szCs w:val="22"/>
+              </w:rPr>
+              <w:t>Mean.Sq</w:t>
+            </w:r>
+            <w:proofErr w:type="spellEnd"/>
+          </w:p>
+        </w:tc>
+        <w:tc>
+          <w:tcPr>
+            <w:tcW w:w="1080" w:type="dxa"/>
+            <w:tcBorders>
+              <w:top w:val="single" w:sz="12" w:space="0" w:color="666666"/>
+              <w:left w:val="nil"/>
+              <w:bottom w:val="single" w:sz="12" w:space="0" w:color="666666"/>
+              <w:right w:val="nil"/>
+            </w:tcBorders>
+            <w:shd w:val="clear" w:color="auto" w:fill="FFFFFF"/>
+            <w:tcMar>
+              <w:top w:w="0" w:type="dxa"/>
+              <w:left w:w="0" w:type="dxa"/>
+              <w:bottom w:w="0" w:type="dxa"/>
+              <w:right w:w="0" w:type="dxa"/>
+            </w:tcMar>
+            <w:vAlign w:val="center"/>
+            <w:hideMark/>
+          </w:tcPr>
+          <w:p>
+            <w:pPr>
+              <w:spacing w:before="100" w:after="100" w:line="240" w:lineRule="auto"/>
+              <w:ind w:left="100" w:right="100"/>
+              <w:jc w:val="right"/>
+              <w:rPr>
+                <w:rFonts w:ascii="Arial" w:eastAsia="Arial" w:hAnsi="Arial" w:cs="Arial"/>
+                <w:color w:val="000000"/>
+                <w:sz w:val="22"/>
+                <w:szCs w:val="22"/>
+              </w:rPr>
+            </w:pPr>
+            <w:proofErr w:type="spellStart"/>
+            <w:r>
+              <w:rPr>
+                <w:rFonts w:ascii="Arial" w:eastAsia="Arial" w:hAnsi="Arial" w:cs="Arial"/>
+                <w:color w:val="000000"/>
+                <w:sz w:val="22"/>
+                <w:szCs w:val="22"/>
+              </w:rPr>
+              <w:t>F.value</w:t>
+            </w:r>
+            <w:proofErr w:type="spellEnd"/>
+          </w:p>
+        </w:tc>
+        <w:tc>
+          <w:tcPr>
+            <w:tcW w:w="1080" w:type="dxa"/>
+            <w:tcBorders>
+              <w:top w:val="single" w:sz="12" w:space="0" w:color="666666"/>
+              <w:left w:val="nil"/>
+              <w:bottom w:val="single" w:sz="12" w:space="0" w:color="666666"/>
+              <w:right w:val="nil"/>
+            </w:tcBorders>
+            <w:shd w:val="clear" w:color="auto" w:fill="FFFFFF"/>
+            <w:tcMar>
+              <w:top w:w="0" w:type="dxa"/>
+              <w:left w:w="0" w:type="dxa"/>
+              <w:bottom w:w="0" w:type="dxa"/>
+              <w:right w:w="0" w:type="dxa"/>
+            </w:tcMar>
+            <w:vAlign w:val="center"/>
+            <w:hideMark/>
+          </w:tcPr>
+          <w:p>
+            <w:pPr>
+              <w:spacing w:before="100" w:after="100" w:line="240" w:lineRule="auto"/>
+              <w:ind w:left="100" w:right="100"/>
+              <w:jc w:val="right"/>
+              <w:rPr>
+                <w:rFonts w:ascii="Arial" w:eastAsia="Arial" w:hAnsi="Arial" w:cs="Arial"/>
+                <w:color w:val="000000"/>
+                <w:sz w:val="22"/>
+                <w:szCs w:val="22"/>
+              </w:rPr>
+            </w:pPr>
+            <w:proofErr w:type="spellStart"/>
+            <w:proofErr w:type="gramStart"/>
+            <w:r>
+              <w:rPr>
+                <w:rFonts w:ascii="Arial" w:eastAsia="Arial" w:hAnsi="Arial" w:cs="Arial"/>
+                <w:color w:val="000000"/>
+                <w:sz w:val="22"/>
+                <w:szCs w:val="22"/>
+              </w:rPr>
+              <w:t>Pr</w:t>
+            </w:r>
+            <w:proofErr w:type="spellEnd"/>
+            <w:r>
+              <w:rPr>
+                <w:rFonts w:ascii="Arial" w:eastAsia="Arial" w:hAnsi="Arial" w:cs="Arial"/>
+                <w:color w:val="000000"/>
+                <w:sz w:val="22"/>
+                <w:szCs w:val="22"/>
+              </w:rPr>
+              <w:t>..F.</w:t>
+            </w:r>
+            <w:proofErr w:type="gramEnd"/>
+          </w:p>
+        </w:tc>
+      </w:tr>
+      <w:tr>
+        <w:tc>
+          <w:tcPr>
+            <w:tcW w:w="1080" w:type="dxa"/>
+            <w:tcBorders>
+              <w:top w:val="single" w:sz="12" w:space="0" w:color="666666"/>
+              <w:left w:val="nil"/>
+              <w:bottom w:val="nil"/>
+              <w:right w:val="nil"/>
+            </w:tcBorders>
+            <w:shd w:val="clear" w:color="auto" w:fill="FFFFFF"/>
+            <w:tcMar>
+              <w:top w:w="0" w:type="dxa"/>
+              <w:left w:w="0" w:type="dxa"/>
+              <w:bottom w:w="0" w:type="dxa"/>
+              <w:right w:w="0" w:type="dxa"/>
+            </w:tcMar>
+            <w:vAlign w:val="center"/>
+            <w:hideMark/>
+          </w:tcPr>
+          <w:p>
+            <w:pPr>
+              <w:spacing w:before="100" w:after="100" w:line="240" w:lineRule="auto"/>
+              <w:ind w:left="100" w:right="100"/>
+              <w:rPr>
+                <w:rFonts w:ascii="Arial" w:eastAsia="Arial" w:hAnsi="Arial" w:cs="Arial"/>
+                <w:color w:val="000000"/>
+                <w:sz w:val="22"/>
+                <w:szCs w:val="22"/>
+              </w:rPr>
+            </w:pPr>
+            <w:r>
+              <w:rPr>
+                <w:rFonts w:ascii="Arial" w:eastAsia="Arial" w:hAnsi="Arial" w:cs="Arial"/>
+                <w:color w:val="000000"/>
+                <w:sz w:val="22"/>
+                <w:szCs w:val="22"/>
+              </w:rPr>
+              <w:t>Region</w:t>
+            </w:r>
+          </w:p>
+        </w:tc>
+        <w:tc>
+          <w:tcPr>
+            <w:tcW w:w="1080" w:type="dxa"/>
+            <w:tcBorders>
+              <w:top w:val="single" w:sz="12" w:space="0" w:color="666666"/>
+              <w:left w:val="nil"/>
+              <w:bottom w:val="nil"/>
+              <w:right w:val="nil"/>
+            </w:tcBorders>
+            <w:shd w:val="clear" w:color="auto" w:fill="FFFFFF"/>
+            <w:tcMar>
+              <w:top w:w="0" w:type="dxa"/>
+              <w:left w:w="0" w:type="dxa"/>
+              <w:bottom w:w="0" w:type="dxa"/>
+              <w:right w:w="0" w:type="dxa"/>
+            </w:tcMar>
+            <w:vAlign w:val="center"/>
+            <w:hideMark/>
+          </w:tcPr>
+          <w:p>
+            <w:pPr>
+              <w:spacing w:before="100" w:after="100" w:line="240" w:lineRule="auto"/>
+              <w:ind w:left="100" w:right="100"/>
+              <w:jc w:val="right"/>
+              <w:rPr>
+                <w:rFonts w:ascii="Arial" w:eastAsia="Arial" w:hAnsi="Arial" w:cs="Arial"/>
+                <w:color w:val="000000"/>
+                <w:sz w:val="22"/>
+                <w:szCs w:val="22"/>
+              </w:rPr>
+            </w:pPr>
+            <w:r>
+              <w:rPr>
+                <w:rFonts w:ascii="Arial" w:eastAsia="Arial" w:hAnsi="Arial" w:cs="Arial"/>
+                <w:color w:val="000000"/>
+                <w:sz w:val="22"/>
+                <w:szCs w:val="22"/>
+              </w:rPr>
+              <w:t>3</w:t>
+            </w:r>
+          </w:p>
+        </w:tc>
+        <w:tc>
+          <w:tcPr>
+            <w:tcW w:w="1080" w:type="dxa"/>
+            <w:tcBorders>
+              <w:top w:val="single" w:sz="12" w:space="0" w:color="666666"/>
+              <w:left w:val="nil"/>
+              <w:bottom w:val="nil"/>
+              <w:right w:val="nil"/>
+            </w:tcBorders>
+            <w:shd w:val="clear" w:color="auto" w:fill="FFFFFF"/>
+            <w:tcMar>
+              <w:top w:w="0" w:type="dxa"/>
+              <w:left w:w="0" w:type="dxa"/>
+              <w:bottom w:w="0" w:type="dxa"/>
+              <w:right w:w="0" w:type="dxa"/>
+            </w:tcMar>
+            <w:vAlign w:val="center"/>
+            <w:hideMark/>
+          </w:tcPr>
+          <w:p>
+            <w:pPr>
+              <w:spacing w:before="100" w:after="100" w:line="240" w:lineRule="auto"/>
+              <w:ind w:left="100" w:right="100"/>
+              <w:jc w:val="right"/>
+              <w:rPr>
+                <w:rFonts w:ascii="Arial" w:eastAsia="Arial" w:hAnsi="Arial" w:cs="Arial"/>
+                <w:color w:val="000000"/>
+                <w:sz w:val="22"/>
+                <w:szCs w:val="22"/>
+              </w:rPr>
+            </w:pPr>
+            <w:r>
+              <w:rPr>
+                <w:rFonts w:ascii="Arial" w:eastAsia="Arial" w:hAnsi="Arial" w:cs="Arial"/>
+                <w:color w:val="000000"/>
+                <w:sz w:val="22"/>
+                <w:szCs w:val="22"/>
+              </w:rPr>
+              <w:t>1,300,759,681</w:t>
+            </w:r>
+          </w:p>
+        </w:tc>
+        <w:tc>
+          <w:tcPr>
+            <w:tcW w:w="1080" w:type="dxa"/>
+            <w:tcBorders>
+              <w:top w:val="single" w:sz="12" w:space="0" w:color="666666"/>
+              <w:left w:val="nil"/>
+              <w:bottom w:val="nil"/>
+              <w:right w:val="nil"/>
+            </w:tcBorders>
+            <w:shd w:val="clear" w:color="auto" w:fill="FFFFFF"/>
+            <w:tcMar>
+              <w:top w:w="0" w:type="dxa"/>
+              <w:left w:w="0" w:type="dxa"/>
+              <w:bottom w:w="0" w:type="dxa"/>
+              <w:right w:w="0" w:type="dxa"/>
+            </w:tcMar>
+            <w:vAlign w:val="center"/>
+            <w:hideMark/>
+          </w:tcPr>
+          <w:p>
+            <w:pPr>
+              <w:spacing w:before="100" w:after="100" w:line="240" w:lineRule="auto"/>
+              <w:ind w:left="100" w:right="100"/>
+              <w:jc w:val="right"/>
+              <w:rPr>
+                <w:rFonts w:ascii="Arial" w:eastAsia="Arial" w:hAnsi="Arial" w:cs="Arial"/>
+                <w:color w:val="000000"/>
+                <w:sz w:val="22"/>
+                <w:szCs w:val="22"/>
+              </w:rPr>
+            </w:pPr>
+            <w:r>
+              <w:rPr>
+                <w:rFonts w:ascii="Arial" w:eastAsia="Arial" w:hAnsi="Arial" w:cs="Arial"/>
+                <w:color w:val="000000"/>
+                <w:sz w:val="22"/>
+                <w:szCs w:val="22"/>
+              </w:rPr>
+              <w:t>433,586,560</w:t>
+            </w:r>
+          </w:p>
+        </w:tc>
+        <w:tc>
+          <w:tcPr>
+            <w:tcW w:w="1080" w:type="dxa"/>
+            <w:tcBorders>
+              <w:top w:val="single" w:sz="12" w:space="0" w:color="666666"/>
+              <w:left w:val="nil"/>
+              <w:bottom w:val="nil"/>
+              <w:right w:val="nil"/>
+            </w:tcBorders>
+            <w:shd w:val="clear" w:color="auto" w:fill="FFFFFF"/>
+            <w:tcMar>
+              <w:top w:w="0" w:type="dxa"/>
+              <w:left w:w="0" w:type="dxa"/>
+              <w:bottom w:w="0" w:type="dxa"/>
+              <w:right w:w="0" w:type="dxa"/>
+            </w:tcMar>
+            <w:vAlign w:val="center"/>
+            <w:hideMark/>
+          </w:tcPr>
+          <w:p>
+            <w:pPr>
+              <w:spacing w:before="100" w:after="100" w:line="240" w:lineRule="auto"/>
+              <w:ind w:left="100" w:right="100"/>
+              <w:jc w:val="right"/>
+              <w:rPr>
+                <w:rFonts w:ascii="Arial" w:eastAsia="Arial" w:hAnsi="Arial" w:cs="Arial"/>
+                <w:color w:val="000000"/>
+                <w:sz w:val="22"/>
+                <w:szCs w:val="22"/>
+              </w:rPr>
+            </w:pPr>
+            <w:r>
+              <w:rPr>
+                <w:rFonts w:ascii="Arial" w:eastAsia="Arial" w:hAnsi="Arial" w:cs="Arial"/>
+                <w:color w:val="000000"/>
+                <w:sz w:val="22"/>
+                <w:szCs w:val="22"/>
+              </w:rPr>
+              <w:t>2.9752836</w:t>
+            </w:r>
+          </w:p>
+        </w:tc>
+        <w:tc>
+          <w:tcPr>
+            <w:tcW w:w="1080" w:type="dxa"/>
+            <w:tcBorders>
+              <w:top w:val="single" w:sz="12" w:space="0" w:color="666666"/>
+              <w:left w:val="nil"/>
+              <w:bottom w:val="nil"/>
+              <w:right w:val="nil"/>
+            </w:tcBorders>
+            <w:shd w:val="clear" w:color="auto" w:fill="FFFFFF"/>
+            <w:tcMar>
+              <w:top w:w="0" w:type="dxa"/>
+              <w:left w:w="0" w:type="dxa"/>
+              <w:bottom w:w="0" w:type="dxa"/>
+              <w:right w:w="0" w:type="dxa"/>
+            </w:tcMar>
+            <w:vAlign w:val="center"/>
+            <w:hideMark/>
+          </w:tcPr>
+          <w:p>
+            <w:pPr>
+              <w:spacing w:before="100" w:after="100" w:line="240" w:lineRule="auto"/>
+              <w:ind w:left="100" w:right="100"/>
+              <w:jc w:val="right"/>
+              <w:rPr>
+                <w:rFonts w:ascii="Arial" w:eastAsia="Arial" w:hAnsi="Arial" w:cs="Arial"/>
+                <w:color w:val="000000"/>
+                <w:sz w:val="22"/>
+                <w:szCs w:val="22"/>
+              </w:rPr>
+            </w:pPr>
+            <w:r>
+              <w:rPr>
+                <w:rFonts w:ascii="Arial" w:eastAsia="Arial" w:hAnsi="Arial" w:cs="Arial"/>
+                <w:color w:val="000000"/>
+                <w:sz w:val="22"/>
+                <w:szCs w:val="22"/>
+              </w:rPr>
+              <w:t>0.03065911</w:t>
+            </w:r>
+          </w:p>
+        </w:tc>
+      </w:tr>
+      <w:tr>
+        <w:tc>
+          <w:tcPr>
+            <w:tcW w:w="1080" w:type="dxa"/>
+            <w:tcBorders>
+              <w:top w:val="nil"/>
+              <w:left w:val="nil"/>
+              <w:bottom w:val="nil"/>
+              <w:right w:val="nil"/>
+            </w:tcBorders>
+            <w:shd w:val="clear" w:color="auto" w:fill="FFFFFF"/>
+            <w:tcMar>
+              <w:top w:w="0" w:type="dxa"/>
+              <w:left w:w="0" w:type="dxa"/>
+              <w:bottom w:w="0" w:type="dxa"/>
+              <w:right w:w="0" w:type="dxa"/>
+            </w:tcMar>
+            <w:vAlign w:val="center"/>
+            <w:hideMark/>
+          </w:tcPr>
+          <w:p>
+            <w:pPr>
+              <w:spacing w:before="100" w:after="100" w:line="240" w:lineRule="auto"/>
+              <w:ind w:left="100" w:right="100"/>
+              <w:rPr>
+                <w:rFonts w:ascii="Arial" w:eastAsia="Arial" w:hAnsi="Arial" w:cs="Arial"/>
+                <w:color w:val="000000"/>
+                <w:sz w:val="22"/>
+                <w:szCs w:val="22"/>
+              </w:rPr>
+            </w:pPr>
+            <w:r>
+              <w:rPr>
+                <w:rFonts w:ascii="Arial" w:eastAsia="Arial" w:hAnsi="Arial" w:cs="Arial"/>
+                <w:color w:val="000000"/>
+                <w:sz w:val="22"/>
+                <w:szCs w:val="22"/>
+              </w:rPr>
+              <w:t>Sex</w:t>
+            </w:r>
+          </w:p>
+        </w:tc>
+        <w:tc>
+          <w:tcPr>
+            <w:tcW w:w="1080" w:type="dxa"/>
+            <w:tcBorders>
+              <w:top w:val="nil"/>
+              <w:left w:val="nil"/>
+              <w:bottom w:val="nil"/>
+              <w:right w:val="nil"/>
+            </w:tcBorders>
+            <w:shd w:val="clear" w:color="auto" w:fill="FFFFFF"/>
+            <w:tcMar>
+              <w:top w:w="0" w:type="dxa"/>
+              <w:left w:w="0" w:type="dxa"/>
+              <w:bottom w:w="0" w:type="dxa"/>
+              <w:right w:w="0" w:type="dxa"/>
+            </w:tcMar>
+            <w:vAlign w:val="center"/>
+            <w:hideMark/>
+          </w:tcPr>
+          <w:p>
+            <w:pPr>
+              <w:spacing w:before="100" w:after="100" w:line="240" w:lineRule="auto"/>
+              <w:ind w:left="100" w:right="100"/>
+              <w:jc w:val="right"/>
+              <w:rPr>
+                <w:rFonts w:ascii="Arial" w:eastAsia="Arial" w:hAnsi="Arial" w:cs="Arial"/>
+                <w:color w:val="000000"/>
+                <w:sz w:val="22"/>
+                <w:szCs w:val="22"/>
+              </w:rPr>
+            </w:pPr>
+            <w:r>
+              <w:rPr>
+                <w:rFonts w:ascii="Arial" w:eastAsia="Arial" w:hAnsi="Arial" w:cs="Arial"/>
+                <w:color w:val="000000"/>
+                <w:sz w:val="22"/>
+                <w:szCs w:val="22"/>
+              </w:rPr>
+              <w:t>1</w:t>
+            </w:r>
+          </w:p>
+        </w:tc>
+        <w:tc>
+          <w:tcPr>
+            <w:tcW w:w="1080" w:type="dxa"/>
+            <w:tcBorders>
+              <w:top w:val="nil"/>
+              <w:left w:val="nil"/>
+              <w:bottom w:val="nil"/>
+              <w:right w:val="nil"/>
+            </w:tcBorders>
+            <w:shd w:val="clear" w:color="auto" w:fill="FFFFFF"/>
+            <w:tcMar>
+              <w:top w:w="0" w:type="dxa"/>
+              <w:left w:w="0" w:type="dxa"/>
+              <w:bottom w:w="0" w:type="dxa"/>
+              <w:right w:w="0" w:type="dxa"/>
+            </w:tcMar>
+            <w:vAlign w:val="center"/>
+            <w:hideMark/>
+          </w:tcPr>
+          <w:p>
+            <w:pPr>
+              <w:spacing w:before="100" w:after="100" w:line="240" w:lineRule="auto"/>
+              <w:ind w:left="100" w:right="100"/>
+              <w:jc w:val="right"/>
+              <w:rPr>
+                <w:rFonts w:ascii="Arial" w:eastAsia="Arial" w:hAnsi="Arial" w:cs="Arial"/>
+                <w:color w:val="000000"/>
+                <w:sz w:val="22"/>
+                <w:szCs w:val="22"/>
+              </w:rPr>
+            </w:pPr>
+            <w:r>
+              <w:rPr>
+                <w:rFonts w:ascii="Arial" w:eastAsia="Arial" w:hAnsi="Arial" w:cs="Arial"/>
+                <w:color w:val="000000"/>
+                <w:sz w:val="22"/>
+                <w:szCs w:val="22"/>
+              </w:rPr>
+              <w:t>613,069,</w:t>
+            </w:r>
+            <w:r>
+              <w:rPr>
+                <w:rFonts w:ascii="Arial" w:eastAsia="Arial" w:hAnsi="Arial" w:cs="Arial"/>
+                <w:color w:val="000000"/>
+                <w:sz w:val="22"/>
+                <w:szCs w:val="22"/>
+              </w:rPr>
+              <w:lastRenderedPageBreak/>
+              <w:t>167</w:t>
+            </w:r>
+          </w:p>
+        </w:tc>
+        <w:tc>
+          <w:tcPr>
+            <w:tcW w:w="1080" w:type="dxa"/>
+            <w:tcBorders>
+              <w:top w:val="nil"/>
+              <w:left w:val="nil"/>
+              <w:bottom w:val="nil"/>
+              <w:right w:val="nil"/>
+            </w:tcBorders>
+            <w:shd w:val="clear" w:color="auto" w:fill="FFFFFF"/>
+            <w:tcMar>
+              <w:top w:w="0" w:type="dxa"/>
+              <w:left w:w="0" w:type="dxa"/>
+              <w:bottom w:w="0" w:type="dxa"/>
+              <w:right w:w="0" w:type="dxa"/>
+            </w:tcMar>
+            <w:vAlign w:val="center"/>
+            <w:hideMark/>
+          </w:tcPr>
+          <w:p>
+            <w:pPr>
+              <w:spacing w:before="100" w:after="100" w:line="240" w:lineRule="auto"/>
+              <w:ind w:left="100" w:right="100"/>
+              <w:jc w:val="right"/>
+              <w:rPr>
+                <w:rFonts w:ascii="Arial" w:eastAsia="Arial" w:hAnsi="Arial" w:cs="Arial"/>
+                <w:color w:val="000000"/>
+                <w:sz w:val="22"/>
+                <w:szCs w:val="22"/>
+              </w:rPr>
+            </w:pPr>
+            <w:r>
+              <w:rPr>
+                <w:rFonts w:ascii="Arial" w:eastAsia="Arial" w:hAnsi="Arial" w:cs="Arial"/>
+                <w:color w:val="000000"/>
+                <w:sz w:val="22"/>
+                <w:szCs w:val="22"/>
+              </w:rPr>
+              <w:lastRenderedPageBreak/>
+              <w:t>613,069,</w:t>
+            </w:r>
+            <w:r>
+              <w:rPr>
+                <w:rFonts w:ascii="Arial" w:eastAsia="Arial" w:hAnsi="Arial" w:cs="Arial"/>
+                <w:color w:val="000000"/>
+                <w:sz w:val="22"/>
+                <w:szCs w:val="22"/>
+              </w:rPr>
+              <w:lastRenderedPageBreak/>
+              <w:t>167</w:t>
+            </w:r>
+          </w:p>
+        </w:tc>
+        <w:tc>
+          <w:tcPr>
+            <w:tcW w:w="1080" w:type="dxa"/>
+            <w:tcBorders>
+              <w:top w:val="nil"/>
+              <w:left w:val="nil"/>
+              <w:bottom w:val="nil"/>
+              <w:right w:val="nil"/>
+            </w:tcBorders>
+            <w:shd w:val="clear" w:color="auto" w:fill="FFFFFF"/>
+            <w:tcMar>
+              <w:top w:w="0" w:type="dxa"/>
+              <w:left w:w="0" w:type="dxa"/>
+              <w:bottom w:w="0" w:type="dxa"/>
+              <w:right w:w="0" w:type="dxa"/>
+            </w:tcMar>
+            <w:vAlign w:val="center"/>
+            <w:hideMark/>
+          </w:tcPr>
+          <w:p>
+            <w:pPr>
+              <w:spacing w:before="100" w:after="100" w:line="240" w:lineRule="auto"/>
+              <w:ind w:left="100" w:right="100"/>
+              <w:jc w:val="right"/>
+              <w:rPr>
+                <w:rFonts w:ascii="Arial" w:eastAsia="Arial" w:hAnsi="Arial" w:cs="Arial"/>
+                <w:color w:val="000000"/>
+                <w:sz w:val="22"/>
+                <w:szCs w:val="22"/>
+              </w:rPr>
+            </w:pPr>
+            <w:r>
+              <w:rPr>
+                <w:rFonts w:ascii="Arial" w:eastAsia="Arial" w:hAnsi="Arial" w:cs="Arial"/>
+                <w:color w:val="000000"/>
+                <w:sz w:val="22"/>
+                <w:szCs w:val="22"/>
+              </w:rPr>
+              <w:lastRenderedPageBreak/>
+              <w:t>4.20689</w:t>
+            </w:r>
+            <w:r>
+              <w:rPr>
+                <w:rFonts w:ascii="Arial" w:eastAsia="Arial" w:hAnsi="Arial" w:cs="Arial"/>
+                <w:color w:val="000000"/>
+                <w:sz w:val="22"/>
+                <w:szCs w:val="22"/>
+              </w:rPr>
+              <w:lastRenderedPageBreak/>
+              <w:t>85</w:t>
+            </w:r>
+          </w:p>
+        </w:tc>
+        <w:tc>
+          <w:tcPr>
+            <w:tcW w:w="1080" w:type="dxa"/>
+            <w:tcBorders>
+              <w:top w:val="nil"/>
+              <w:left w:val="nil"/>
+              <w:bottom w:val="nil"/>
+              <w:right w:val="nil"/>
+            </w:tcBorders>
+            <w:shd w:val="clear" w:color="auto" w:fill="FFFFFF"/>
+            <w:tcMar>
+              <w:top w:w="0" w:type="dxa"/>
+              <w:left w:w="0" w:type="dxa"/>
+              <w:bottom w:w="0" w:type="dxa"/>
+              <w:right w:w="0" w:type="dxa"/>
+            </w:tcMar>
+            <w:vAlign w:val="center"/>
+            <w:hideMark/>
+          </w:tcPr>
+          <w:p>
+            <w:pPr>
+              <w:spacing w:before="100" w:after="100" w:line="240" w:lineRule="auto"/>
+              <w:ind w:left="100" w:right="100"/>
+              <w:jc w:val="right"/>
+              <w:rPr>
+                <w:rFonts w:ascii="Arial" w:eastAsia="Arial" w:hAnsi="Arial" w:cs="Arial"/>
+                <w:color w:val="000000"/>
+                <w:sz w:val="22"/>
+                <w:szCs w:val="22"/>
+              </w:rPr>
+            </w:pPr>
+            <w:r>
+              <w:rPr>
+                <w:rFonts w:ascii="Arial" w:eastAsia="Arial" w:hAnsi="Arial" w:cs="Arial"/>
+                <w:color w:val="000000"/>
+                <w:sz w:val="22"/>
+                <w:szCs w:val="22"/>
+              </w:rPr>
+              <w:lastRenderedPageBreak/>
+              <w:t>0.04045</w:t>
+            </w:r>
+            <w:r>
+              <w:rPr>
+                <w:rFonts w:ascii="Arial" w:eastAsia="Arial" w:hAnsi="Arial" w:cs="Arial"/>
+                <w:color w:val="000000"/>
+                <w:sz w:val="22"/>
+                <w:szCs w:val="22"/>
+              </w:rPr>
+              <w:lastRenderedPageBreak/>
+              <w:t>544</w:t>
+            </w:r>
+          </w:p>
+        </w:tc>
+      </w:tr>
+      <w:tr>
+        <w:tc>
+          <w:tcPr>
+            <w:tcW w:w="1080" w:type="dxa"/>
+            <w:tcBorders>
+              <w:top w:val="nil"/>
+              <w:left w:val="nil"/>
+              <w:bottom w:val="nil"/>
+              <w:right w:val="nil"/>
+            </w:tcBorders>
+            <w:shd w:val="clear" w:color="auto" w:fill="FFFFFF"/>
+            <w:tcMar>
+              <w:top w:w="0" w:type="dxa"/>
+              <w:left w:w="0" w:type="dxa"/>
+              <w:bottom w:w="0" w:type="dxa"/>
+              <w:right w:w="0" w:type="dxa"/>
+            </w:tcMar>
+            <w:vAlign w:val="center"/>
+            <w:hideMark/>
+          </w:tcPr>
+          <w:p>
+            <w:pPr>
+              <w:spacing w:before="100" w:after="100" w:line="240" w:lineRule="auto"/>
+              <w:ind w:left="100" w:right="100"/>
+              <w:rPr>
+                <w:rFonts w:ascii="Arial" w:eastAsia="Arial" w:hAnsi="Arial" w:cs="Arial"/>
+                <w:color w:val="000000"/>
+                <w:sz w:val="22"/>
+                <w:szCs w:val="22"/>
+              </w:rPr>
+            </w:pPr>
+            <w:proofErr w:type="spellStart"/>
+            <w:proofErr w:type="gramStart"/>
+            <w:r>
+              <w:rPr>
+                <w:rFonts w:ascii="Arial" w:eastAsia="Arial" w:hAnsi="Arial" w:cs="Arial"/>
+                <w:color w:val="000000"/>
+                <w:sz w:val="22"/>
+                <w:szCs w:val="22"/>
+              </w:rPr>
+              <w:lastRenderedPageBreak/>
+              <w:t>Region:Sex</w:t>
+            </w:r>
+            <w:proofErr w:type="spellEnd"/>
+            <w:proofErr w:type="gramEnd"/>
+          </w:p>
+        </w:tc>
+        <w:tc>
+          <w:tcPr>
+            <w:tcW w:w="1080" w:type="dxa"/>
+            <w:tcBorders>
+              <w:top w:val="nil"/>
+              <w:left w:val="nil"/>
+              <w:bottom w:val="nil"/>
+              <w:right w:val="nil"/>
+            </w:tcBorders>
+            <w:shd w:val="clear" w:color="auto" w:fill="FFFFFF"/>
+            <w:tcMar>
+              <w:top w:w="0" w:type="dxa"/>
+              <w:left w:w="0" w:type="dxa"/>
+              <w:bottom w:w="0" w:type="dxa"/>
+              <w:right w:w="0" w:type="dxa"/>
+            </w:tcMar>
+            <w:vAlign w:val="center"/>
+            <w:hideMark/>
+          </w:tcPr>
+          <w:p>
+            <w:pPr>
+              <w:spacing w:before="100" w:after="100" w:line="240" w:lineRule="auto"/>
+              <w:ind w:left="100" w:right="100"/>
+              <w:jc w:val="right"/>
+              <w:rPr>
+                <w:rFonts w:ascii="Arial" w:eastAsia="Arial" w:hAnsi="Arial" w:cs="Arial"/>
+                <w:color w:val="000000"/>
+                <w:sz w:val="22"/>
+                <w:szCs w:val="22"/>
+              </w:rPr>
+            </w:pPr>
+            <w:r>
+              <w:rPr>
+                <w:rFonts w:ascii="Arial" w:eastAsia="Arial" w:hAnsi="Arial" w:cs="Arial"/>
+                <w:color w:val="000000"/>
+                <w:sz w:val="22"/>
+                <w:szCs w:val="22"/>
+              </w:rPr>
+              <w:t>3</w:t>
+            </w:r>
+          </w:p>
+        </w:tc>
+        <w:tc>
+          <w:tcPr>
+            <w:tcW w:w="1080" w:type="dxa"/>
+            <w:tcBorders>
+              <w:top w:val="nil"/>
+              <w:left w:val="nil"/>
+              <w:bottom w:val="nil"/>
+              <w:right w:val="nil"/>
+            </w:tcBorders>
+            <w:shd w:val="clear" w:color="auto" w:fill="FFFFFF"/>
+            <w:tcMar>
+              <w:top w:w="0" w:type="dxa"/>
+              <w:left w:w="0" w:type="dxa"/>
+              <w:bottom w:w="0" w:type="dxa"/>
+              <w:right w:w="0" w:type="dxa"/>
+            </w:tcMar>
+            <w:vAlign w:val="center"/>
+            <w:hideMark/>
+          </w:tcPr>
+          <w:p>
+            <w:pPr>
+              <w:spacing w:before="100" w:after="100" w:line="240" w:lineRule="auto"/>
+              <w:ind w:left="100" w:right="100"/>
+              <w:jc w:val="right"/>
+              <w:rPr>
+                <w:rFonts w:ascii="Arial" w:eastAsia="Arial" w:hAnsi="Arial" w:cs="Arial"/>
+                <w:color w:val="000000"/>
+                <w:sz w:val="22"/>
+                <w:szCs w:val="22"/>
+              </w:rPr>
+            </w:pPr>
+            <w:r>
+              <w:rPr>
+                <w:rFonts w:ascii="Arial" w:eastAsia="Arial" w:hAnsi="Arial" w:cs="Arial"/>
+                <w:color w:val="000000"/>
+                <w:sz w:val="22"/>
+                <w:szCs w:val="22"/>
+              </w:rPr>
+              <w:t>340,173,346</w:t>
+            </w:r>
+          </w:p>
+        </w:tc>
+        <w:tc>
+          <w:tcPr>
+            <w:tcW w:w="1080" w:type="dxa"/>
+            <w:tcBorders>
+              <w:top w:val="nil"/>
+              <w:left w:val="nil"/>
+              <w:bottom w:val="nil"/>
+              <w:right w:val="nil"/>
+            </w:tcBorders>
+            <w:shd w:val="clear" w:color="auto" w:fill="FFFFFF"/>
+            <w:tcMar>
+              <w:top w:w="0" w:type="dxa"/>
+              <w:left w:w="0" w:type="dxa"/>
+              <w:bottom w:w="0" w:type="dxa"/>
+              <w:right w:w="0" w:type="dxa"/>
+            </w:tcMar>
+            <w:vAlign w:val="center"/>
+            <w:hideMark/>
+          </w:tcPr>
+          <w:p>
+            <w:pPr>
+              <w:spacing w:before="100" w:after="100" w:line="240" w:lineRule="auto"/>
+              <w:ind w:left="100" w:right="100"/>
+              <w:jc w:val="right"/>
+              <w:rPr>
+                <w:rFonts w:ascii="Arial" w:eastAsia="Arial" w:hAnsi="Arial" w:cs="Arial"/>
+                <w:color w:val="000000"/>
+                <w:sz w:val="22"/>
+                <w:szCs w:val="22"/>
+              </w:rPr>
+            </w:pPr>
+            <w:r>
+              <w:rPr>
+                <w:rFonts w:ascii="Arial" w:eastAsia="Arial" w:hAnsi="Arial" w:cs="Arial"/>
+                <w:color w:val="000000"/>
+                <w:sz w:val="22"/>
+                <w:szCs w:val="22"/>
+              </w:rPr>
+              <w:t>113,391,115</w:t>
+            </w:r>
+          </w:p>
+        </w:tc>
+        <w:tc>
+          <w:tcPr>
+            <w:tcW w:w="1080" w:type="dxa"/>
+            <w:tcBorders>
+              <w:top w:val="nil"/>
+              <w:left w:val="nil"/>
+              <w:bottom w:val="nil"/>
+              <w:right w:val="nil"/>
+            </w:tcBorders>
+            <w:shd w:val="clear" w:color="auto" w:fill="FFFFFF"/>
+            <w:tcMar>
+              <w:top w:w="0" w:type="dxa"/>
+              <w:left w:w="0" w:type="dxa"/>
+              <w:bottom w:w="0" w:type="dxa"/>
+              <w:right w:w="0" w:type="dxa"/>
+            </w:tcMar>
+            <w:vAlign w:val="center"/>
+            <w:hideMark/>
+          </w:tcPr>
+          <w:p>
+            <w:pPr>
+              <w:spacing w:before="100" w:after="100" w:line="240" w:lineRule="auto"/>
+              <w:ind w:left="100" w:right="100"/>
+              <w:jc w:val="right"/>
+              <w:rPr>
+                <w:rFonts w:ascii="Arial" w:eastAsia="Arial" w:hAnsi="Arial" w:cs="Arial"/>
+                <w:color w:val="000000"/>
+                <w:sz w:val="22"/>
+                <w:szCs w:val="22"/>
+              </w:rPr>
+            </w:pPr>
+            <w:r>
+              <w:rPr>
+                <w:rFonts w:ascii="Arial" w:eastAsia="Arial" w:hAnsi="Arial" w:cs="Arial"/>
+                <w:color w:val="000000"/>
+                <w:sz w:val="22"/>
+                <w:szCs w:val="22"/>
+              </w:rPr>
+              <w:t>0.7780931</w:t>
+            </w:r>
+          </w:p>
+        </w:tc>
+        <w:tc>
+          <w:tcPr>
+            <w:tcW w:w="1080" w:type="dxa"/>
+            <w:tcBorders>
+              <w:top w:val="nil"/>
+              <w:left w:val="nil"/>
+              <w:bottom w:val="nil"/>
+              <w:right w:val="nil"/>
+            </w:tcBorders>
+            <w:shd w:val="clear" w:color="auto" w:fill="FFFFFF"/>
+            <w:tcMar>
+              <w:top w:w="0" w:type="dxa"/>
+              <w:left w:w="0" w:type="dxa"/>
+              <w:bottom w:w="0" w:type="dxa"/>
+              <w:right w:w="0" w:type="dxa"/>
+            </w:tcMar>
+            <w:vAlign w:val="center"/>
+            <w:hideMark/>
+          </w:tcPr>
+          <w:p>
+            <w:pPr>
+              <w:spacing w:before="100" w:after="100" w:line="240" w:lineRule="auto"/>
+              <w:ind w:left="100" w:right="100"/>
+              <w:jc w:val="right"/>
+              <w:rPr>
+                <w:rFonts w:ascii="Arial" w:eastAsia="Arial" w:hAnsi="Arial" w:cs="Arial"/>
+                <w:color w:val="000000"/>
+                <w:sz w:val="22"/>
+                <w:szCs w:val="22"/>
+              </w:rPr>
+            </w:pPr>
+            <w:r>
+              <w:rPr>
+                <w:rFonts w:ascii="Arial" w:eastAsia="Arial" w:hAnsi="Arial" w:cs="Arial"/>
+                <w:color w:val="000000"/>
+                <w:sz w:val="22"/>
+                <w:szCs w:val="22"/>
+              </w:rPr>
+              <w:t>0.50620765</w:t>
+            </w:r>
+          </w:p>
+        </w:tc>
+      </w:tr>
+      <w:tr>
+        <w:tc>
+          <w:tcPr>
+            <w:tcW w:w="1080" w:type="dxa"/>
+            <w:tcBorders>
+              <w:top w:val="nil"/>
+              <w:left w:val="nil"/>
+              <w:bottom w:val="single" w:sz="12" w:space="0" w:color="666666"/>
+              <w:right w:val="nil"/>
+            </w:tcBorders>
+            <w:shd w:val="clear" w:color="auto" w:fill="FFFFFF"/>
+            <w:tcMar>
+              <w:top w:w="0" w:type="dxa"/>
+              <w:left w:w="0" w:type="dxa"/>
+              <w:bottom w:w="0" w:type="dxa"/>
+              <w:right w:w="0" w:type="dxa"/>
+            </w:tcMar>
+            <w:vAlign w:val="center"/>
+            <w:hideMark/>
+          </w:tcPr>
+          <w:p>
+            <w:pPr>
+              <w:spacing w:before="100" w:after="100" w:line="240" w:lineRule="auto"/>
+              <w:ind w:left="100" w:right="100"/>
+              <w:rPr>
+                <w:rFonts w:ascii="Arial" w:eastAsia="Arial" w:hAnsi="Arial" w:cs="Arial"/>
+                <w:color w:val="000000"/>
+                <w:sz w:val="22"/>
+                <w:szCs w:val="22"/>
+              </w:rPr>
+            </w:pPr>
+            <w:r>
+              <w:rPr>
+                <w:rFonts w:ascii="Arial" w:eastAsia="Arial" w:hAnsi="Arial" w:cs="Arial"/>
+                <w:color w:val="000000"/>
+                <w:sz w:val="22"/>
+                <w:szCs w:val="22"/>
+              </w:rPr>
+              <w:t>Residuals</w:t>
+            </w:r>
+          </w:p>
+        </w:tc>
+        <w:tc>
+          <w:tcPr>
+            <w:tcW w:w="1080" w:type="dxa"/>
+            <w:tcBorders>
+              <w:top w:val="nil"/>
+              <w:left w:val="nil"/>
+              <w:bottom w:val="single" w:sz="12" w:space="0" w:color="666666"/>
+              <w:right w:val="nil"/>
+            </w:tcBorders>
+            <w:shd w:val="clear" w:color="auto" w:fill="FFFFFF"/>
+            <w:tcMar>
+              <w:top w:w="0" w:type="dxa"/>
+              <w:left w:w="0" w:type="dxa"/>
+              <w:bottom w:w="0" w:type="dxa"/>
+              <w:right w:w="0" w:type="dxa"/>
+            </w:tcMar>
+            <w:vAlign w:val="center"/>
+            <w:hideMark/>
+          </w:tcPr>
+          <w:p>
+            <w:pPr>
+              <w:spacing w:before="100" w:after="100" w:line="240" w:lineRule="auto"/>
+              <w:ind w:left="100" w:right="100"/>
+              <w:jc w:val="right"/>
+              <w:rPr>
+                <w:rFonts w:ascii="Arial" w:eastAsia="Arial" w:hAnsi="Arial" w:cs="Arial"/>
+                <w:color w:val="000000"/>
+                <w:sz w:val="22"/>
+                <w:szCs w:val="22"/>
+              </w:rPr>
+            </w:pPr>
+            <w:r>
+              <w:rPr>
+                <w:rFonts w:ascii="Arial" w:eastAsia="Arial" w:hAnsi="Arial" w:cs="Arial"/>
+                <w:color w:val="000000"/>
+                <w:sz w:val="22"/>
+                <w:szCs w:val="22"/>
+              </w:rPr>
+              <w:t>1,330</w:t>
+            </w:r>
+          </w:p>
+        </w:tc>
+        <w:tc>
+          <w:tcPr>
+            <w:tcW w:w="1080" w:type="dxa"/>
+            <w:tcBorders>
+              <w:top w:val="nil"/>
+              <w:left w:val="nil"/>
+              <w:bottom w:val="single" w:sz="12" w:space="0" w:color="666666"/>
+              <w:right w:val="nil"/>
+            </w:tcBorders>
+            <w:shd w:val="clear" w:color="auto" w:fill="FFFFFF"/>
+            <w:tcMar>
+              <w:top w:w="0" w:type="dxa"/>
+              <w:left w:w="0" w:type="dxa"/>
+              <w:bottom w:w="0" w:type="dxa"/>
+              <w:right w:w="0" w:type="dxa"/>
+            </w:tcMar>
+            <w:vAlign w:val="center"/>
+            <w:hideMark/>
+          </w:tcPr>
+          <w:p>
+            <w:pPr>
+              <w:spacing w:before="100" w:after="100" w:line="240" w:lineRule="auto"/>
+              <w:ind w:left="100" w:right="100"/>
+              <w:jc w:val="right"/>
+              <w:rPr>
+                <w:rFonts w:ascii="Arial" w:eastAsia="Arial" w:hAnsi="Arial" w:cs="Arial"/>
+                <w:color w:val="000000"/>
+                <w:sz w:val="22"/>
+                <w:szCs w:val="22"/>
+              </w:rPr>
+            </w:pPr>
+            <w:r>
+              <w:rPr>
+                <w:rFonts w:ascii="Arial" w:eastAsia="Arial" w:hAnsi="Arial" w:cs="Arial"/>
+                <w:color w:val="000000"/>
+                <w:sz w:val="22"/>
+                <w:szCs w:val="22"/>
+              </w:rPr>
+              <w:t>193,820,219,374</w:t>
+            </w:r>
+          </w:p>
+        </w:tc>
+        <w:tc>
+          <w:tcPr>
+            <w:tcW w:w="1080" w:type="dxa"/>
+            <w:tcBorders>
+              <w:top w:val="nil"/>
+              <w:left w:val="nil"/>
+              <w:bottom w:val="single" w:sz="12" w:space="0" w:color="666666"/>
+              <w:right w:val="nil"/>
+            </w:tcBorders>
+            <w:shd w:val="clear" w:color="auto" w:fill="FFFFFF"/>
+            <w:tcMar>
+              <w:top w:w="0" w:type="dxa"/>
+              <w:left w:w="0" w:type="dxa"/>
+              <w:bottom w:w="0" w:type="dxa"/>
+              <w:right w:w="0" w:type="dxa"/>
+            </w:tcMar>
+            <w:vAlign w:val="center"/>
+            <w:hideMark/>
+          </w:tcPr>
+          <w:p>
+            <w:pPr>
+              <w:spacing w:before="100" w:after="100" w:line="240" w:lineRule="auto"/>
+              <w:ind w:left="100" w:right="100"/>
+              <w:jc w:val="right"/>
+              <w:rPr>
+                <w:rFonts w:ascii="Arial" w:eastAsia="Arial" w:hAnsi="Arial" w:cs="Arial"/>
+                <w:color w:val="000000"/>
+                <w:sz w:val="22"/>
+                <w:szCs w:val="22"/>
+              </w:rPr>
+            </w:pPr>
+            <w:r>
+              <w:rPr>
+                <w:rFonts w:ascii="Arial" w:eastAsia="Arial" w:hAnsi="Arial" w:cs="Arial"/>
+                <w:color w:val="000000"/>
+                <w:sz w:val="22"/>
+                <w:szCs w:val="22"/>
+              </w:rPr>
+              <w:t>145,729,488</w:t>
+            </w:r>
+          </w:p>
+        </w:tc>
+        <w:tc>
+          <w:tcPr>
+            <w:tcW w:w="1080" w:type="dxa"/>
+            <w:tcBorders>
+              <w:top w:val="nil"/>
+              <w:left w:val="nil"/>
+              <w:bottom w:val="single" w:sz="12" w:space="0" w:color="666666"/>
+              <w:right w:val="nil"/>
+            </w:tcBorders>
+            <w:shd w:val="clear" w:color="auto" w:fill="FFFFFF"/>
+            <w:tcMar>
+              <w:top w:w="0" w:type="dxa"/>
+              <w:left w:w="0" w:type="dxa"/>
+              <w:bottom w:w="0" w:type="dxa"/>
+              <w:right w:w="0" w:type="dxa"/>
+            </w:tcMar>
+            <w:vAlign w:val="center"/>
+          </w:tcPr>
+          <w:p>
+            <w:pPr>
+              <w:spacing w:before="100" w:after="100" w:line="240" w:lineRule="auto"/>
+              <w:ind w:left="100" w:right="100"/>
+              <w:jc w:val="right"/>
+              <w:rPr>
+                <w:rFonts w:ascii="Arial" w:eastAsia="Arial" w:hAnsi="Arial" w:cs="Arial"/>
+                <w:color w:val="000000"/>
+                <w:sz w:val="22"/>
+                <w:szCs w:val="22"/>
+              </w:rPr>
+            </w:pPr>
+          </w:p>
+        </w:tc>
+        <w:tc>
+          <w:tcPr>
+            <w:tcW w:w="1080" w:type="dxa"/>
+            <w:tcBorders>
+              <w:top w:val="nil"/>
+              <w:left w:val="nil"/>
+              <w:bottom w:val="single" w:sz="12" w:space="0" w:color="666666"/>
+              <w:right w:val="nil"/>
+            </w:tcBorders>
+            <w:shd w:val="clear" w:color="auto" w:fill="FFFFFF"/>
+            <w:tcMar>
+              <w:top w:w="0" w:type="dxa"/>
+              <w:left w:w="0" w:type="dxa"/>
+              <w:bottom w:w="0" w:type="dxa"/>
+              <w:right w:w="0" w:type="dxa"/>
+            </w:tcMar>
+            <w:vAlign w:val="center"/>
+          </w:tcPr>
+          <w:p>
+            <w:pPr>
+              <w:spacing w:before="100" w:after="100" w:line="240" w:lineRule="auto"/>
+              <w:ind w:left="100" w:right="100"/>
+              <w:jc w:val="right"/>
+              <w:rPr>
+                <w:rFonts w:ascii="Arial" w:eastAsia="Arial" w:hAnsi="Arial" w:cs="Arial"/>
+                <w:color w:val="000000"/>
+                <w:sz w:val="22"/>
+                <w:szCs w:val="22"/>
+              </w:rPr>
+            </w:pPr>
+          </w:p>
+        </w:tc>
+      </w:tr>
+    </w:tbl>
+    <w:p>
+      <w:pPr>
+        <w:spacing w:after="120"/>
+        <w:rPr>
+          <w:rFonts w:ascii="Aptos" w:eastAsia="Aptos" w:hAnsi="Aptos" w:cs="Times New Roman"/>
+        </w:rPr>
+      </w:pPr>
+    </w:p>
+    <w:p>
+      <w:pPr>
+        <w:pStyle w:val="CaptionedFigure"/>
+      </w:pPr>
+      <w:r>
+        <w:rPr>
+          <w:noProof/>
+        </w:rPr>
+        <w:drawing>
+          <wp:inline distT="0" distB="0" distL="0" distR="0" wp14:anchorId="233FA7B5" wp14:editId="7024748B">
+            <wp:extent cx="4619625" cy="3695700"/>
+            <wp:effectExtent l="0" t="0" r="0" b="0"/>
+            <wp:docPr id="1207264487" name="Picture 3" descr="Figure 1: TukeyHSD Visualization, differences in mean medical costs billed by insurance (charges) region by region. This makes visible the significant difference in mean medical costs between the southwest and southeast regions, as shown by the 95% confidence interval for the difference in their mean costs not including 0"/>
+            <wp:cNvGraphicFramePr>
+              <a:graphicFrameLocks xmlns:a="http://schemas.openxmlformats.org/drawingml/2006/main" noChangeAspect="1"/>
+            </wp:cNvGraphicFramePr>
+            <a:graphic xmlns:a="http://schemas.openxmlformats.org/drawingml/2006/main">
+              <a:graphicData uri="http://schemas.openxmlformats.org/drawingml/2006/picture">
+                <pic:pic xmlns:pic="http://schemas.openxmlformats.org/drawingml/2006/picture">
+                  <pic:nvPicPr>
+                    <pic:cNvPr id="0" name="Picture" descr="Figure 1: TukeyHSD Visualization, differences in mean medical costs billed by insurance (charges) region by region. This makes visible the significant difference in mean medical costs between the southwest and southeast regions, as shown by the 95% confidence interval for the difference in their mean costs not including 0"/>
+                    <pic:cNvPicPr>
+                      <a:picLocks noChangeAspect="1" noChangeArrowheads="1"/>
+                    </pic:cNvPicPr>
+                  </pic:nvPicPr>
+                  <pic:blipFill>
+                    <a:blip r:embed="rId5">
+                      <a:extLst>
+                        <a:ext uri="{28A0092B-C50C-407E-A947-70E740481C1C}">
+                          <a14:useLocalDpi xmlns:a14="http://schemas.microsoft.com/office/drawing/2010/main" val="0"/>
+                        </a:ext>
+                      </a:extLst>
+                    </a:blip>
+                    <a:srcRect/>
+                    <a:stretch>
+                      <a:fillRect/>
+                    </a:stretch>
+                  </pic:blipFill>
+                  <pic:spPr bwMode="auto">
+                    <a:xfrm>
+                      <a:off x="0" y="0"/>
+                      <a:ext cx="4619625" cy="3695700"/>
+                    </a:xfrm>
+                    <a:prstGeom prst="rect">
+                      <a:avLst/>
+                    </a:prstGeom>
+                    <a:noFill/>
+                    <a:ln>
+                      <a:noFill/>
+                    </a:ln>
+                  </pic:spPr>
+                </pic:pic>
+              </a:graphicData>
+            </a:graphic>
+          </wp:inline>
+        </w:drawing>
+      </w:r>
+    </w:p>
+    <w:p>
+      <w:pPr>
+        <w:pStyle w:val="ImageCaption"/>
+      </w:pPr>
+      <w:r>
+        <w:t xml:space="preserve">Figure 1: </w:t>
+      </w:r>
+      <w:proofErr w:type="spellStart"/>
+      <w:r>
+        <w:t>TukeyHSD</w:t>
+      </w:r>
+      <w:proofErr w:type="spellEnd"/>
+      <w:r>
+        <w:t xml:space="preserve"> Visualization, differences in mean medical costs billed by insurance (charges) region by region. This makes visible the significant difference in mean medical costs between the southwest and southeast regions, as shown by the 95% confidence interval for the difference in their mean costs not including 0</w:t>
+      </w:r>
+    </w:p>
+    <w:p>
+      <w:pPr>
+        <w:spacing w:after="120"/>
+        <w:rPr>
+          <w:rFonts w:ascii="Aptos" w:eastAsia="Aptos" w:hAnsi="Aptos" w:cs="Times New Roman"/>
+          <w:i/>
+        </w:rPr>
+      </w:pPr>
+    </w:p>
+    <w:p>
+      <w:pPr>
         <w:pStyle w:val="Bibliography"/>
       </w:pPr>
-      <w:bookmarkStart w:id="3" w:name="ref-stednick_2022_data"/>
-      <w:bookmarkStart w:id="4" w:name="refs"/>
       <w:proofErr w:type="spellStart"/>
       <w:r>
         <w:t>Stednick</w:t>
@@ -152,7 +1615,7 @@
       <w:r>
         <w:t xml:space="preserve">, Zach. 2022. “Data for Machine Learning with r.” GitHub. </w:t>
       </w:r>
-      <w:hyperlink r:id="rId5">
+      <w:hyperlink r:id="rId6">
         <w:r>
           <w:rPr>
             <w:rStyle w:val="Hyperlink"/>
@@ -848,7 +2311,6 @@
   <w:style w:type="character" w:default="1" w:styleId="DefaultParagraphFont">
     <w:name w:val="Default Paragraph Font"/>
     <w:uiPriority w:val="1"/>
-    <w:semiHidden/>
     <w:unhideWhenUsed/>
   </w:style>
   <w:style w:type="table" w:default="1" w:styleId="TableNormal">
@@ -1248,6 +2710,10 @@
   <w:style w:type="paragraph" w:customStyle="1" w:styleId="ImageCaption">
     <w:name w:val="Image Caption"/>
     <w:basedOn w:val="Caption"/>
+    <w:rsid w:val="00A821A9"/>
+    <w:pPr>
+      <w:spacing w:line="240" w:lineRule="auto"/>
+    </w:pPr>
   </w:style>
   <w:style w:type="paragraph" w:customStyle="1" w:styleId="Figure">
     <w:name w:val="Figure"/>
@@ -1256,8 +2722,10 @@
   <w:style w:type="paragraph" w:customStyle="1" w:styleId="CaptionedFigure">
     <w:name w:val="Captioned Figure"/>
     <w:basedOn w:val="Figure"/>
+    <w:rsid w:val="00A821A9"/>
     <w:pPr>
       <w:keepNext/>
+      <w:spacing w:line="240" w:lineRule="auto"/>
     </w:pPr>
   </w:style>
   <w:style w:type="character" w:customStyle="1" w:styleId="CaptionChar">

</xml_diff>